<commit_message>
chore: update APA 7th edition template file
</commit_message>
<xml_diff>
--- a/static/files/APA-7th-edition-template-jkw.docx
+++ b/static/files/APA-7th-edition-template-jkw.docx
@@ -194,7 +194,15 @@
       </w:r>
       <w:proofErr w:type="spellEnd"/>
       <w:r>
-        <w:t xml:space="preserve">. Aliquam </w:t>
+        <w:t xml:space="preserve">. </w:t>
+      </w:r>
+      <w:proofErr w:type="spellStart"/>
+      <w:r>
+        <w:t>Aliquam</w:t>
+      </w:r>
+      <w:proofErr w:type="spellEnd"/>
+      <w:r>
+        <w:t xml:space="preserve"> </w:t>
       </w:r>
       <w:proofErr w:type="spellStart"/>
       <w:r>
@@ -234,15 +242,7 @@
       </w:r>
       <w:proofErr w:type="spellEnd"/>
       <w:r>
-        <w:t xml:space="preserve"> </w:t>
-      </w:r>
-      <w:proofErr w:type="spellStart"/>
-      <w:r>
-        <w:t>nunc</w:t>
-      </w:r>
-      <w:proofErr w:type="spellEnd"/>
-      <w:r>
-        <w:t xml:space="preserve">. In </w:t>
+        <w:t xml:space="preserve"> nunc. In </w:t>
       </w:r>
       <w:proofErr w:type="spellStart"/>
       <w:r>
@@ -250,15 +250,7 @@
       </w:r>
       <w:proofErr w:type="spellEnd"/>
       <w:r>
-        <w:t xml:space="preserve"> ligula </w:t>
-      </w:r>
-      <w:proofErr w:type="spellStart"/>
-      <w:r>
-        <w:t>quis</w:t>
-      </w:r>
-      <w:proofErr w:type="spellEnd"/>
-      <w:r>
-        <w:t xml:space="preserve"> </w:t>
+        <w:t xml:space="preserve"> ligula quis </w:t>
       </w:r>
       <w:proofErr w:type="spellStart"/>
       <w:r>
@@ -650,15 +642,7 @@
       </w:r>
       <w:proofErr w:type="spellEnd"/>
       <w:r>
-        <w:t xml:space="preserve"> </w:t>
-      </w:r>
-      <w:proofErr w:type="spellStart"/>
-      <w:r>
-        <w:t>quis</w:t>
-      </w:r>
-      <w:proofErr w:type="spellEnd"/>
-      <w:r>
-        <w:t xml:space="preserve"> </w:t>
+        <w:t xml:space="preserve"> quis </w:t>
       </w:r>
       <w:proofErr w:type="spellStart"/>
       <w:r>
@@ -730,15 +714,7 @@
       </w:r>
       <w:proofErr w:type="spellEnd"/>
       <w:r>
-        <w:t xml:space="preserve"> pulvinar </w:t>
-      </w:r>
-      <w:proofErr w:type="spellStart"/>
-      <w:r>
-        <w:t>est</w:t>
-      </w:r>
-      <w:proofErr w:type="spellEnd"/>
-      <w:r>
-        <w:t xml:space="preserve"> </w:t>
+        <w:t xml:space="preserve"> pulvinar est </w:t>
       </w:r>
       <w:proofErr w:type="spellStart"/>
       <w:r>
@@ -882,15 +858,7 @@
       </w:r>
       <w:proofErr w:type="spellEnd"/>
       <w:r>
-        <w:t xml:space="preserve"> </w:t>
-      </w:r>
-      <w:proofErr w:type="spellStart"/>
-      <w:r>
-        <w:t>quis</w:t>
-      </w:r>
-      <w:proofErr w:type="spellEnd"/>
-      <w:r>
-        <w:t xml:space="preserve"> </w:t>
+        <w:t xml:space="preserve"> quis </w:t>
       </w:r>
       <w:proofErr w:type="spellStart"/>
       <w:r>
@@ -1172,7 +1140,15 @@
       </w:r>
       <w:proofErr w:type="spellEnd"/>
       <w:r>
-        <w:t xml:space="preserve">. Aliquam </w:t>
+        <w:t xml:space="preserve">. </w:t>
+      </w:r>
+      <w:proofErr w:type="spellStart"/>
+      <w:r>
+        <w:t>Aliquam</w:t>
+      </w:r>
+      <w:proofErr w:type="spellEnd"/>
+      <w:r>
+        <w:t xml:space="preserve"> </w:t>
       </w:r>
       <w:proofErr w:type="spellStart"/>
       <w:r>
@@ -1212,15 +1188,7 @@
       </w:r>
       <w:proofErr w:type="spellEnd"/>
       <w:r>
-        <w:t xml:space="preserve"> </w:t>
-      </w:r>
-      <w:proofErr w:type="spellStart"/>
-      <w:r>
-        <w:t>nunc</w:t>
-      </w:r>
-      <w:proofErr w:type="spellEnd"/>
-      <w:r>
-        <w:t xml:space="preserve">. In </w:t>
+        <w:t xml:space="preserve"> nunc. In </w:t>
       </w:r>
       <w:proofErr w:type="spellStart"/>
       <w:r>
@@ -1228,15 +1196,7 @@
       </w:r>
       <w:proofErr w:type="spellEnd"/>
       <w:r>
-        <w:t xml:space="preserve"> ligula </w:t>
-      </w:r>
-      <w:proofErr w:type="spellStart"/>
-      <w:r>
-        <w:t>quis</w:t>
-      </w:r>
-      <w:proofErr w:type="spellEnd"/>
-      <w:r>
-        <w:t xml:space="preserve"> </w:t>
+        <w:t xml:space="preserve"> ligula quis </w:t>
       </w:r>
       <w:proofErr w:type="spellStart"/>
       <w:r>
@@ -1637,15 +1597,7 @@
       </w:r>
       <w:proofErr w:type="spellEnd"/>
       <w:r>
-        <w:t xml:space="preserve"> </w:t>
-      </w:r>
-      <w:proofErr w:type="spellStart"/>
-      <w:r>
-        <w:t>quis</w:t>
-      </w:r>
-      <w:proofErr w:type="spellEnd"/>
-      <w:r>
-        <w:t xml:space="preserve"> </w:t>
+        <w:t xml:space="preserve"> quis </w:t>
       </w:r>
       <w:proofErr w:type="spellStart"/>
       <w:r>
@@ -1731,15 +1683,7 @@
       </w:r>
       <w:proofErr w:type="spellEnd"/>
       <w:r>
-        <w:t xml:space="preserve"> pulvinar </w:t>
-      </w:r>
-      <w:proofErr w:type="spellStart"/>
-      <w:r>
-        <w:t>est</w:t>
-      </w:r>
-      <w:proofErr w:type="spellEnd"/>
-      <w:r>
-        <w:t xml:space="preserve"> </w:t>
+        <w:t xml:space="preserve"> pulvinar est </w:t>
       </w:r>
       <w:proofErr w:type="spellStart"/>
       <w:r>
@@ -1883,15 +1827,7 @@
       </w:r>
       <w:proofErr w:type="spellEnd"/>
       <w:r>
-        <w:t xml:space="preserve"> </w:t>
-      </w:r>
-      <w:proofErr w:type="spellStart"/>
-      <w:r>
-        <w:t>quis</w:t>
-      </w:r>
-      <w:proofErr w:type="spellEnd"/>
-      <w:r>
-        <w:t xml:space="preserve"> </w:t>
+        <w:t xml:space="preserve"> quis </w:t>
       </w:r>
       <w:proofErr w:type="spellStart"/>
       <w:r>
@@ -2012,7 +1948,15 @@
       </w:r>
       <w:proofErr w:type="spellEnd"/>
       <w:r>
-        <w:t xml:space="preserve"> eros. Aliquam </w:t>
+        <w:t xml:space="preserve"> eros. </w:t>
+      </w:r>
+      <w:proofErr w:type="spellStart"/>
+      <w:r>
+        <w:t>Aliquam</w:t>
+      </w:r>
+      <w:proofErr w:type="spellEnd"/>
+      <w:r>
+        <w:t xml:space="preserve"> </w:t>
       </w:r>
       <w:proofErr w:type="spellStart"/>
       <w:r>
@@ -2913,7 +2857,15 @@
       </w:r>
       <w:proofErr w:type="spellEnd"/>
       <w:r>
-        <w:t xml:space="preserve">. Aliquam </w:t>
+        <w:t xml:space="preserve">. </w:t>
+      </w:r>
+      <w:proofErr w:type="spellStart"/>
+      <w:r>
+        <w:t>Aliquam</w:t>
+      </w:r>
+      <w:proofErr w:type="spellEnd"/>
+      <w:r>
+        <w:t xml:space="preserve"> </w:t>
       </w:r>
       <w:proofErr w:type="spellStart"/>
       <w:r>
@@ -2953,15 +2905,7 @@
       </w:r>
       <w:proofErr w:type="spellEnd"/>
       <w:r>
-        <w:t xml:space="preserve"> </w:t>
-      </w:r>
-      <w:proofErr w:type="spellStart"/>
-      <w:r>
-        <w:t>nunc</w:t>
-      </w:r>
-      <w:proofErr w:type="spellEnd"/>
-      <w:r>
-        <w:t xml:space="preserve">. In </w:t>
+        <w:t xml:space="preserve"> nunc. In </w:t>
       </w:r>
       <w:proofErr w:type="spellStart"/>
       <w:r>
@@ -2969,15 +2913,7 @@
       </w:r>
       <w:proofErr w:type="spellEnd"/>
       <w:r>
-        <w:t xml:space="preserve"> ligula </w:t>
-      </w:r>
-      <w:proofErr w:type="spellStart"/>
-      <w:r>
-        <w:t>quis</w:t>
-      </w:r>
-      <w:proofErr w:type="spellEnd"/>
-      <w:r>
-        <w:t xml:space="preserve"> </w:t>
+        <w:t xml:space="preserve"> ligula quis </w:t>
       </w:r>
       <w:proofErr w:type="spellStart"/>
       <w:r>
@@ -3369,15 +3305,7 @@
       </w:r>
       <w:proofErr w:type="spellEnd"/>
       <w:r>
-        <w:t xml:space="preserve"> </w:t>
-      </w:r>
-      <w:proofErr w:type="spellStart"/>
-      <w:r>
-        <w:t>quis</w:t>
-      </w:r>
-      <w:proofErr w:type="spellEnd"/>
-      <w:r>
-        <w:t xml:space="preserve"> </w:t>
+        <w:t xml:space="preserve"> quis </w:t>
       </w:r>
       <w:proofErr w:type="spellStart"/>
       <w:r>
@@ -3454,15 +3382,7 @@
       </w:r>
       <w:proofErr w:type="spellEnd"/>
       <w:r>
-        <w:t xml:space="preserve"> pulvinar </w:t>
-      </w:r>
-      <w:proofErr w:type="spellStart"/>
-      <w:r>
-        <w:t>est</w:t>
-      </w:r>
-      <w:proofErr w:type="spellEnd"/>
-      <w:r>
-        <w:t xml:space="preserve"> </w:t>
+        <w:t xml:space="preserve"> pulvinar est </w:t>
       </w:r>
       <w:proofErr w:type="spellStart"/>
       <w:r>
@@ -3606,15 +3526,7 @@
       </w:r>
       <w:proofErr w:type="spellEnd"/>
       <w:r>
-        <w:t xml:space="preserve"> </w:t>
-      </w:r>
-      <w:proofErr w:type="spellStart"/>
-      <w:r>
-        <w:t>quis</w:t>
-      </w:r>
-      <w:proofErr w:type="spellEnd"/>
-      <w:r>
-        <w:t xml:space="preserve"> </w:t>
+        <w:t xml:space="preserve"> quis </w:t>
       </w:r>
       <w:proofErr w:type="spellStart"/>
       <w:r>
@@ -3730,7 +3642,15 @@
       </w:r>
       <w:proofErr w:type="spellEnd"/>
       <w:r>
-        <w:t xml:space="preserve"> eros. Aliquam </w:t>
+        <w:t xml:space="preserve"> eros. </w:t>
+      </w:r>
+      <w:proofErr w:type="spellStart"/>
+      <w:r>
+        <w:t>Aliquam</w:t>
+      </w:r>
+      <w:proofErr w:type="spellEnd"/>
+      <w:r>
+        <w:t xml:space="preserve"> </w:t>
       </w:r>
       <w:proofErr w:type="spellStart"/>
       <w:r>
@@ -4105,7 +4025,15 @@
       </w:r>
       <w:proofErr w:type="spellEnd"/>
       <w:r>
-        <w:t xml:space="preserve">. Aliquam </w:t>
+        <w:t xml:space="preserve">. </w:t>
+      </w:r>
+      <w:proofErr w:type="spellStart"/>
+      <w:r>
+        <w:t>Aliquam</w:t>
+      </w:r>
+      <w:proofErr w:type="spellEnd"/>
+      <w:r>
+        <w:t xml:space="preserve"> </w:t>
       </w:r>
       <w:proofErr w:type="spellStart"/>
       <w:r>
@@ -4145,15 +4073,7 @@
       </w:r>
       <w:proofErr w:type="spellEnd"/>
       <w:r>
-        <w:t xml:space="preserve"> </w:t>
-      </w:r>
-      <w:proofErr w:type="spellStart"/>
-      <w:r>
-        <w:t>nunc</w:t>
-      </w:r>
-      <w:proofErr w:type="spellEnd"/>
-      <w:r>
-        <w:t xml:space="preserve">. In </w:t>
+        <w:t xml:space="preserve"> nunc. In </w:t>
       </w:r>
       <w:proofErr w:type="spellStart"/>
       <w:r>
@@ -4161,15 +4081,7 @@
       </w:r>
       <w:proofErr w:type="spellEnd"/>
       <w:r>
-        <w:t xml:space="preserve"> ligula </w:t>
-      </w:r>
-      <w:proofErr w:type="spellStart"/>
-      <w:r>
-        <w:t>quis</w:t>
-      </w:r>
-      <w:proofErr w:type="spellEnd"/>
-      <w:r>
-        <w:t xml:space="preserve"> </w:t>
+        <w:t xml:space="preserve"> ligula quis </w:t>
       </w:r>
       <w:proofErr w:type="spellStart"/>
       <w:r>
@@ -4561,15 +4473,7 @@
       </w:r>
       <w:proofErr w:type="spellEnd"/>
       <w:r>
-        <w:t xml:space="preserve"> </w:t>
-      </w:r>
-      <w:proofErr w:type="spellStart"/>
-      <w:r>
-        <w:t>quis</w:t>
-      </w:r>
-      <w:proofErr w:type="spellEnd"/>
-      <w:r>
-        <w:t xml:space="preserve"> </w:t>
+        <w:t xml:space="preserve"> quis </w:t>
       </w:r>
       <w:proofErr w:type="spellStart"/>
       <w:r>
@@ -4646,15 +4550,7 @@
       </w:r>
       <w:proofErr w:type="spellEnd"/>
       <w:r>
-        <w:t xml:space="preserve"> pulvinar </w:t>
-      </w:r>
-      <w:proofErr w:type="spellStart"/>
-      <w:r>
-        <w:t>est</w:t>
-      </w:r>
-      <w:proofErr w:type="spellEnd"/>
-      <w:r>
-        <w:t xml:space="preserve"> </w:t>
+        <w:t xml:space="preserve"> pulvinar est </w:t>
       </w:r>
       <w:proofErr w:type="spellStart"/>
       <w:r>
@@ -4798,15 +4694,7 @@
       </w:r>
       <w:proofErr w:type="spellEnd"/>
       <w:r>
-        <w:t xml:space="preserve"> </w:t>
-      </w:r>
-      <w:proofErr w:type="spellStart"/>
-      <w:r>
-        <w:t>quis</w:t>
-      </w:r>
-      <w:proofErr w:type="spellEnd"/>
-      <w:r>
-        <w:t xml:space="preserve"> </w:t>
+        <w:t xml:space="preserve"> quis </w:t>
       </w:r>
       <w:proofErr w:type="spellStart"/>
       <w:r>
@@ -4904,6 +4792,308 @@
       <w:r>
         <w:t xml:space="preserve"> eros.</w:t>
       </w:r>
+    </w:p>
+    <w:p>
+      <w:pPr>
+        <w:ind w:firstLine="0"/>
+        <w:rPr>
+          <w:b/>
+          <w:bCs/>
+        </w:rPr>
+      </w:pPr>
+      <w:r>
+        <w:rPr>
+          <w:b/>
+          <w:bCs/>
+        </w:rPr>
+        <w:t>Limitations</w:t>
+      </w:r>
+    </w:p>
+    <w:p>
+      <w:r>
+        <w:t xml:space="preserve">Mauris </w:t>
+      </w:r>
+      <w:proofErr w:type="spellStart"/>
+      <w:r>
+        <w:t>facilisis</w:t>
+      </w:r>
+      <w:proofErr w:type="spellEnd"/>
+      <w:r>
+        <w:t xml:space="preserve"> libero </w:t>
+      </w:r>
+      <w:proofErr w:type="spellStart"/>
+      <w:r>
+        <w:t>eget</w:t>
+      </w:r>
+      <w:proofErr w:type="spellEnd"/>
+      <w:r>
+        <w:t xml:space="preserve"> </w:t>
+      </w:r>
+      <w:proofErr w:type="spellStart"/>
+      <w:r>
+        <w:t>nibh</w:t>
+      </w:r>
+      <w:proofErr w:type="spellEnd"/>
+      <w:r>
+        <w:t xml:space="preserve"> pulvinar, </w:t>
+      </w:r>
+      <w:proofErr w:type="spellStart"/>
+      <w:r>
+        <w:t>sed</w:t>
+      </w:r>
+      <w:proofErr w:type="spellEnd"/>
+      <w:r>
+        <w:t xml:space="preserve"> pulvinar est </w:t>
+      </w:r>
+      <w:proofErr w:type="spellStart"/>
+      <w:r>
+        <w:t>sollicitudin</w:t>
+      </w:r>
+      <w:proofErr w:type="spellEnd"/>
+      <w:r>
+        <w:t xml:space="preserve">. Nam </w:t>
+      </w:r>
+      <w:proofErr w:type="spellStart"/>
+      <w:r>
+        <w:t>vel</w:t>
+      </w:r>
+      <w:proofErr w:type="spellEnd"/>
+      <w:r>
+        <w:t xml:space="preserve"> ex </w:t>
+      </w:r>
+      <w:proofErr w:type="spellStart"/>
+      <w:r>
+        <w:t>ornare</w:t>
+      </w:r>
+      <w:proofErr w:type="spellEnd"/>
+      <w:r>
+        <w:t xml:space="preserve"> </w:t>
+      </w:r>
+      <w:proofErr w:type="spellStart"/>
+      <w:r>
+        <w:t>elit</w:t>
+      </w:r>
+      <w:proofErr w:type="spellEnd"/>
+      <w:r>
+        <w:t xml:space="preserve"> </w:t>
+      </w:r>
+      <w:proofErr w:type="spellStart"/>
+      <w:r>
+        <w:t>blandit</w:t>
+      </w:r>
+      <w:proofErr w:type="spellEnd"/>
+      <w:r>
+        <w:t xml:space="preserve"> </w:t>
+      </w:r>
+      <w:proofErr w:type="spellStart"/>
+      <w:r>
+        <w:t>iaculis</w:t>
+      </w:r>
+      <w:proofErr w:type="spellEnd"/>
+      <w:r>
+        <w:t xml:space="preserve">. Sed </w:t>
+      </w:r>
+      <w:proofErr w:type="spellStart"/>
+      <w:r>
+        <w:t>venenatis</w:t>
+      </w:r>
+      <w:proofErr w:type="spellEnd"/>
+      <w:r>
+        <w:t xml:space="preserve"> magna </w:t>
+      </w:r>
+      <w:proofErr w:type="spellStart"/>
+      <w:r>
+        <w:t>ut</w:t>
+      </w:r>
+      <w:proofErr w:type="spellEnd"/>
+      <w:r>
+        <w:t xml:space="preserve"> </w:t>
+      </w:r>
+      <w:proofErr w:type="spellStart"/>
+      <w:r>
+        <w:t>congue</w:t>
+      </w:r>
+      <w:proofErr w:type="spellEnd"/>
+      <w:r>
+        <w:t xml:space="preserve"> fermentum. </w:t>
+      </w:r>
+      <w:proofErr w:type="spellStart"/>
+      <w:r>
+        <w:t>Pellentesque</w:t>
+      </w:r>
+      <w:proofErr w:type="spellEnd"/>
+      <w:r>
+        <w:t xml:space="preserve"> </w:t>
+      </w:r>
+      <w:proofErr w:type="spellStart"/>
+      <w:r>
+        <w:t>suscipit</w:t>
+      </w:r>
+      <w:proofErr w:type="spellEnd"/>
+      <w:r>
+        <w:t xml:space="preserve"> vitae </w:t>
+      </w:r>
+      <w:proofErr w:type="spellStart"/>
+      <w:r>
+        <w:t>erat</w:t>
+      </w:r>
+      <w:proofErr w:type="spellEnd"/>
+      <w:r>
+        <w:t xml:space="preserve"> in </w:t>
+      </w:r>
+      <w:proofErr w:type="spellStart"/>
+      <w:r>
+        <w:t>varius</w:t>
+      </w:r>
+      <w:proofErr w:type="spellEnd"/>
+      <w:r>
+        <w:t xml:space="preserve">. </w:t>
+      </w:r>
+      <w:proofErr w:type="spellStart"/>
+      <w:r>
+        <w:t>Suspendisse</w:t>
+      </w:r>
+      <w:proofErr w:type="spellEnd"/>
+      <w:r>
+        <w:t xml:space="preserve"> porta </w:t>
+      </w:r>
+      <w:proofErr w:type="spellStart"/>
+      <w:r>
+        <w:t>aliquet</w:t>
+      </w:r>
+      <w:proofErr w:type="spellEnd"/>
+      <w:r>
+        <w:t xml:space="preserve"> </w:t>
+      </w:r>
+      <w:proofErr w:type="spellStart"/>
+      <w:r>
+        <w:t>arcu</w:t>
+      </w:r>
+      <w:proofErr w:type="spellEnd"/>
+      <w:r>
+        <w:t xml:space="preserve"> et </w:t>
+      </w:r>
+      <w:proofErr w:type="spellStart"/>
+      <w:r>
+        <w:t>ornare</w:t>
+      </w:r>
+      <w:proofErr w:type="spellEnd"/>
+      <w:r>
+        <w:t xml:space="preserve">. </w:t>
+      </w:r>
+      <w:proofErr w:type="spellStart"/>
+      <w:r>
+        <w:t>Quisque</w:t>
+      </w:r>
+      <w:proofErr w:type="spellEnd"/>
+      <w:r>
+        <w:t xml:space="preserve"> quis </w:t>
+      </w:r>
+      <w:proofErr w:type="spellStart"/>
+      <w:r>
+        <w:t>tellus</w:t>
+      </w:r>
+      <w:proofErr w:type="spellEnd"/>
+      <w:r>
+        <w:t xml:space="preserve"> </w:t>
+      </w:r>
+      <w:proofErr w:type="spellStart"/>
+      <w:r>
+        <w:t>dolor</w:t>
+      </w:r>
+      <w:proofErr w:type="spellEnd"/>
+      <w:r>
+        <w:t xml:space="preserve">. Morbi </w:t>
+      </w:r>
+      <w:r>
+        <w:lastRenderedPageBreak/>
+        <w:t xml:space="preserve">mi </w:t>
+      </w:r>
+      <w:proofErr w:type="spellStart"/>
+      <w:r>
+        <w:t>turpis</w:t>
+      </w:r>
+      <w:proofErr w:type="spellEnd"/>
+      <w:r>
+        <w:t xml:space="preserve">, dictum </w:t>
+      </w:r>
+      <w:proofErr w:type="spellStart"/>
+      <w:r>
+        <w:t>sed</w:t>
+      </w:r>
+      <w:proofErr w:type="spellEnd"/>
+      <w:r>
+        <w:t xml:space="preserve"> </w:t>
+      </w:r>
+      <w:proofErr w:type="spellStart"/>
+      <w:r>
+        <w:t>purus</w:t>
+      </w:r>
+      <w:proofErr w:type="spellEnd"/>
+      <w:r>
+        <w:t xml:space="preserve"> </w:t>
+      </w:r>
+      <w:proofErr w:type="spellStart"/>
+      <w:r>
+        <w:t>tempor</w:t>
+      </w:r>
+      <w:proofErr w:type="spellEnd"/>
+      <w:r>
+        <w:t xml:space="preserve">, </w:t>
+      </w:r>
+      <w:proofErr w:type="spellStart"/>
+      <w:r>
+        <w:t>aliquam</w:t>
+      </w:r>
+      <w:proofErr w:type="spellEnd"/>
+      <w:r>
+        <w:t xml:space="preserve"> </w:t>
+      </w:r>
+      <w:proofErr w:type="spellStart"/>
+      <w:r>
+        <w:t>consequat</w:t>
+      </w:r>
+      <w:proofErr w:type="spellEnd"/>
+      <w:r>
+        <w:t xml:space="preserve"> ex. Vestibulum </w:t>
+      </w:r>
+      <w:proofErr w:type="spellStart"/>
+      <w:r>
+        <w:t>tincidunt</w:t>
+      </w:r>
+      <w:proofErr w:type="spellEnd"/>
+      <w:r>
+        <w:t xml:space="preserve"> et </w:t>
+      </w:r>
+      <w:proofErr w:type="spellStart"/>
+      <w:r>
+        <w:t>tortor</w:t>
+      </w:r>
+      <w:proofErr w:type="spellEnd"/>
+      <w:r>
+        <w:t xml:space="preserve"> id </w:t>
+      </w:r>
+      <w:proofErr w:type="spellStart"/>
+      <w:r>
+        <w:t>accumsan</w:t>
+      </w:r>
+      <w:proofErr w:type="spellEnd"/>
+      <w:r>
+        <w:t xml:space="preserve">. Cras nec </w:t>
+      </w:r>
+      <w:proofErr w:type="spellStart"/>
+      <w:r>
+        <w:t>arcu</w:t>
+      </w:r>
+      <w:proofErr w:type="spellEnd"/>
+      <w:r>
+        <w:t xml:space="preserve"> eros.</w:t>
+      </w:r>
+    </w:p>
+    <w:p>
+      <w:pPr>
+        <w:ind w:firstLine="0"/>
+      </w:pPr>
     </w:p>
     <w:p>
       <w:pPr>
@@ -5819,56 +6009,6 @@
       <w:pPr>
         <w:spacing w:after="160" w:line="259" w:lineRule="auto"/>
         <w:ind w:firstLine="0"/>
-        <w:rPr>
-          <w:i/>
-        </w:rPr>
-      </w:pPr>
-      <w:r>
-        <w:rPr>
-          <w:i/>
-          <w:noProof/>
-        </w:rPr>
-        <w:drawing>
-          <wp:inline distT="114300" distB="114300" distL="114300" distR="114300" wp14:anchorId="6B81AC71" wp14:editId="68C149AF">
-            <wp:extent cx="4976813" cy="3075340"/>
-            <wp:effectExtent l="0" t="0" r="0" b="0"/>
-            <wp:docPr id="1" name="image2.png"/>
-            <wp:cNvGraphicFramePr/>
-            <a:graphic xmlns:a="http://schemas.openxmlformats.org/drawingml/2006/main">
-              <a:graphicData uri="http://schemas.openxmlformats.org/drawingml/2006/picture">
-                <pic:pic xmlns:pic="http://schemas.openxmlformats.org/drawingml/2006/picture">
-                  <pic:nvPicPr>
-                    <pic:cNvPr id="0" name="image2.png"/>
-                    <pic:cNvPicPr preferRelativeResize="0"/>
-                  </pic:nvPicPr>
-                  <pic:blipFill>
-                    <a:blip r:embed="rId6"/>
-                    <a:srcRect/>
-                    <a:stretch>
-                      <a:fillRect/>
-                    </a:stretch>
-                  </pic:blipFill>
-                  <pic:spPr>
-                    <a:xfrm>
-                      <a:off x="0" y="0"/>
-                      <a:ext cx="4976813" cy="3075340"/>
-                    </a:xfrm>
-                    <a:prstGeom prst="rect">
-                      <a:avLst/>
-                    </a:prstGeom>
-                    <a:ln/>
-                  </pic:spPr>
-                </pic:pic>
-              </a:graphicData>
-            </a:graphic>
-          </wp:inline>
-        </w:drawing>
-      </w:r>
-    </w:p>
-    <w:p>
-      <w:pPr>
-        <w:spacing w:after="160" w:line="259" w:lineRule="auto"/>
-        <w:ind w:firstLine="0"/>
       </w:pPr>
       <w:r>
         <w:rPr>
@@ -5904,7 +6044,17 @@
         <w:t>** Make sure to indicate in the body of the manuscript where figures should be added</w:t>
       </w:r>
     </w:p>
+    <w:p>
+      <w:pPr>
+        <w:spacing w:after="160" w:line="259" w:lineRule="auto"/>
+        <w:ind w:firstLine="0"/>
+      </w:pPr>
+      <w:r>
+        <w:t>*** Do not add titles in the figures per se</w:t>
+      </w:r>
+    </w:p>
     <w:sectPr>
+      <w:headerReference w:type="even" r:id="rId6"/>
       <w:headerReference w:type="default" r:id="rId7"/>
       <w:headerReference w:type="first" r:id="rId8"/>
       <w:pgSz w:w="11909" w:h="16834"/>
@@ -5968,66 +6118,130 @@
 
 <file path=word/header1.xml><?xml version="1.0" encoding="utf-8"?>
 <w:hdr xmlns:wpc="http://schemas.microsoft.com/office/word/2010/wordprocessingCanvas" xmlns:cx="http://schemas.microsoft.com/office/drawing/2014/chartex" xmlns:cx1="http://schemas.microsoft.com/office/drawing/2015/9/8/chartex" xmlns:cx2="http://schemas.microsoft.com/office/drawing/2015/10/21/chartex" xmlns:cx3="http://schemas.microsoft.com/office/drawing/2016/5/9/chartex" xmlns:cx4="http://schemas.microsoft.com/office/drawing/2016/5/10/chartex" xmlns:cx5="http://schemas.microsoft.com/office/drawing/2016/5/11/chartex" xmlns:cx6="http://schemas.microsoft.com/office/drawing/2016/5/12/chartex" xmlns:cx7="http://schemas.microsoft.com/office/drawing/2016/5/13/chartex" xmlns:cx8="http://schemas.microsoft.com/office/drawing/2016/5/14/chartex" xmlns:mc="http://schemas.openxmlformats.org/markup-compatibility/2006" xmlns:aink="http://schemas.microsoft.com/office/drawing/2016/ink" xmlns:am3d="http://schemas.microsoft.com/office/drawing/2017/model3d" xmlns:o="urn:schemas-microsoft-com:office:office" xmlns:oel="http://schemas.microsoft.com/office/2019/extlst" xmlns:r="http://schemas.openxmlformats.org/officeDocument/2006/relationships" xmlns:m="http://schemas.openxmlformats.org/officeDocument/2006/math" xmlns:v="urn:schemas-microsoft-com:vml" xmlns:wp14="http://schemas.microsoft.com/office/word/2010/wordprocessingDrawing" xmlns:wp="http://schemas.openxmlformats.org/drawingml/2006/wordprocessingDrawing" xmlns:w10="urn:schemas-microsoft-com:office:word" xmlns:w="http://schemas.openxmlformats.org/wordprocessingml/2006/main" xmlns:w14="http://schemas.microsoft.com/office/word/2010/wordml" xmlns:w15="http://schemas.microsoft.com/office/word/2012/wordml" xmlns:w16cex="http://schemas.microsoft.com/office/word/2018/wordml/cex" xmlns:w16cid="http://schemas.microsoft.com/office/word/2016/wordml/cid" xmlns:w16="http://schemas.microsoft.com/office/word/2018/wordml" xmlns:w16du="http://schemas.microsoft.com/office/word/2023/wordml/word16du" xmlns:w16sdtdh="http://schemas.microsoft.com/office/word/2020/wordml/sdtdatahash" xmlns:w16sdtfl="http://schemas.microsoft.com/office/word/2024/wordml/sdtformatlock" xmlns:w16se="http://schemas.microsoft.com/office/word/2015/wordml/symex" xmlns:wpg="http://schemas.microsoft.com/office/word/2010/wordprocessingGroup" xmlns:wpi="http://schemas.microsoft.com/office/word/2010/wordprocessingInk" xmlns:wne="http://schemas.microsoft.com/office/word/2006/wordml" xmlns:wps="http://schemas.microsoft.com/office/word/2010/wordprocessingShape" mc:Ignorable="w14 w15 w16se w16cid w16 w16cex w16sdtdh w16sdtfl w16du wp14">
+  <w:sdt>
+    <w:sdtPr>
+      <w:rPr>
+        <w:rStyle w:val="PageNumber"/>
+      </w:rPr>
+      <w:id w:val="-1215269715"/>
+      <w:docPartObj>
+        <w:docPartGallery w:val="Page Numbers (Top of Page)"/>
+        <w:docPartUnique/>
+      </w:docPartObj>
+    </w:sdtPr>
+    <w:sdtContent>
+      <w:p>
+        <w:pPr>
+          <w:pStyle w:val="Header"/>
+          <w:framePr w:wrap="none" w:vAnchor="text" w:hAnchor="margin" w:xAlign="right" w:y="1"/>
+          <w:rPr>
+            <w:rStyle w:val="PageNumber"/>
+          </w:rPr>
+        </w:pPr>
+        <w:r>
+          <w:rPr>
+            <w:rStyle w:val="PageNumber"/>
+          </w:rPr>
+          <w:fldChar w:fldCharType="begin"/>
+        </w:r>
+        <w:r>
+          <w:rPr>
+            <w:rStyle w:val="PageNumber"/>
+          </w:rPr>
+          <w:instrText xml:space="preserve"> PAGE </w:instrText>
+        </w:r>
+        <w:r>
+          <w:rPr>
+            <w:rStyle w:val="PageNumber"/>
+          </w:rPr>
+          <w:fldChar w:fldCharType="separate"/>
+        </w:r>
+        <w:r>
+          <w:rPr>
+            <w:rStyle w:val="PageNumber"/>
+          </w:rPr>
+          <w:fldChar w:fldCharType="end"/>
+        </w:r>
+      </w:p>
+    </w:sdtContent>
+  </w:sdt>
   <w:p>
     <w:pPr>
-      <w:ind w:firstLine="0"/>
+      <w:pStyle w:val="Header"/>
+      <w:ind w:right="360"/>
     </w:pPr>
-    <w:r>
-      <w:t>RUNNING HEAD</w:t>
-    </w:r>
-    <w:r>
-      <w:tab/>
-    </w:r>
-    <w:r>
-      <w:tab/>
-    </w:r>
-    <w:r>
-      <w:tab/>
-    </w:r>
-    <w:r>
-      <w:tab/>
-    </w:r>
-    <w:r>
-      <w:tab/>
-    </w:r>
-    <w:r>
-      <w:tab/>
-    </w:r>
-    <w:r>
-      <w:tab/>
-    </w:r>
-    <w:r>
-      <w:tab/>
-    </w:r>
-    <w:r>
-      <w:tab/>
-    </w:r>
-    <w:r>
-      <w:tab/>
-    </w:r>
-    <w:r>
-      <w:fldChar w:fldCharType="begin"/>
-    </w:r>
-    <w:r>
-      <w:instrText>PAGE</w:instrText>
-    </w:r>
-    <w:r>
-      <w:fldChar w:fldCharType="separate"/>
-    </w:r>
-    <w:r>
-      <w:rPr>
-        <w:noProof/>
-      </w:rPr>
-      <w:t>1</w:t>
-    </w:r>
-    <w:r>
-      <w:fldChar w:fldCharType="end"/>
-    </w:r>
   </w:p>
 </w:hdr>
 </file>
 
 <file path=word/header2.xml><?xml version="1.0" encoding="utf-8"?>
+<w:hdr xmlns:wpc="http://schemas.microsoft.com/office/word/2010/wordprocessingCanvas" xmlns:cx="http://schemas.microsoft.com/office/drawing/2014/chartex" xmlns:cx1="http://schemas.microsoft.com/office/drawing/2015/9/8/chartex" xmlns:cx2="http://schemas.microsoft.com/office/drawing/2015/10/21/chartex" xmlns:cx3="http://schemas.microsoft.com/office/drawing/2016/5/9/chartex" xmlns:cx4="http://schemas.microsoft.com/office/drawing/2016/5/10/chartex" xmlns:cx5="http://schemas.microsoft.com/office/drawing/2016/5/11/chartex" xmlns:cx6="http://schemas.microsoft.com/office/drawing/2016/5/12/chartex" xmlns:cx7="http://schemas.microsoft.com/office/drawing/2016/5/13/chartex" xmlns:cx8="http://schemas.microsoft.com/office/drawing/2016/5/14/chartex" xmlns:mc="http://schemas.openxmlformats.org/markup-compatibility/2006" xmlns:aink="http://schemas.microsoft.com/office/drawing/2016/ink" xmlns:am3d="http://schemas.microsoft.com/office/drawing/2017/model3d" xmlns:o="urn:schemas-microsoft-com:office:office" xmlns:oel="http://schemas.microsoft.com/office/2019/extlst" xmlns:r="http://schemas.openxmlformats.org/officeDocument/2006/relationships" xmlns:m="http://schemas.openxmlformats.org/officeDocument/2006/math" xmlns:v="urn:schemas-microsoft-com:vml" xmlns:wp14="http://schemas.microsoft.com/office/word/2010/wordprocessingDrawing" xmlns:wp="http://schemas.openxmlformats.org/drawingml/2006/wordprocessingDrawing" xmlns:w10="urn:schemas-microsoft-com:office:word" xmlns:w="http://schemas.openxmlformats.org/wordprocessingml/2006/main" xmlns:w14="http://schemas.microsoft.com/office/word/2010/wordml" xmlns:w15="http://schemas.microsoft.com/office/word/2012/wordml" xmlns:w16cex="http://schemas.microsoft.com/office/word/2018/wordml/cex" xmlns:w16cid="http://schemas.microsoft.com/office/word/2016/wordml/cid" xmlns:w16="http://schemas.microsoft.com/office/word/2018/wordml" xmlns:w16du="http://schemas.microsoft.com/office/word/2023/wordml/word16du" xmlns:w16sdtdh="http://schemas.microsoft.com/office/word/2020/wordml/sdtdatahash" xmlns:w16sdtfl="http://schemas.microsoft.com/office/word/2024/wordml/sdtformatlock" xmlns:w16se="http://schemas.microsoft.com/office/word/2015/wordml/symex" xmlns:wpg="http://schemas.microsoft.com/office/word/2010/wordprocessingGroup" xmlns:wpi="http://schemas.microsoft.com/office/word/2010/wordprocessingInk" xmlns:wne="http://schemas.microsoft.com/office/word/2006/wordml" xmlns:wps="http://schemas.microsoft.com/office/word/2010/wordprocessingShape" mc:Ignorable="w14 w15 w16se w16cid w16 w16cex w16sdtdh w16sdtfl w16du wp14">
+  <w:sdt>
+    <w:sdtPr>
+      <w:rPr>
+        <w:rStyle w:val="PageNumber"/>
+      </w:rPr>
+      <w:id w:val="-1825500711"/>
+      <w:docPartObj>
+        <w:docPartGallery w:val="Page Numbers (Top of Page)"/>
+        <w:docPartUnique/>
+      </w:docPartObj>
+    </w:sdtPr>
+    <w:sdtContent>
+      <w:p>
+        <w:pPr>
+          <w:pStyle w:val="Header"/>
+          <w:framePr w:wrap="none" w:vAnchor="text" w:hAnchor="margin" w:xAlign="right" w:y="1"/>
+          <w:rPr>
+            <w:rStyle w:val="PageNumber"/>
+          </w:rPr>
+        </w:pPr>
+        <w:r>
+          <w:rPr>
+            <w:rStyle w:val="PageNumber"/>
+          </w:rPr>
+          <w:fldChar w:fldCharType="begin"/>
+        </w:r>
+        <w:r>
+          <w:rPr>
+            <w:rStyle w:val="PageNumber"/>
+          </w:rPr>
+          <w:instrText xml:space="preserve"> PAGE </w:instrText>
+        </w:r>
+        <w:r>
+          <w:rPr>
+            <w:rStyle w:val="PageNumber"/>
+          </w:rPr>
+          <w:fldChar w:fldCharType="separate"/>
+        </w:r>
+        <w:r>
+          <w:rPr>
+            <w:rStyle w:val="PageNumber"/>
+            <w:noProof/>
+          </w:rPr>
+          <w:t>2</w:t>
+        </w:r>
+        <w:r>
+          <w:rPr>
+            <w:rStyle w:val="PageNumber"/>
+          </w:rPr>
+          <w:fldChar w:fldCharType="end"/>
+        </w:r>
+      </w:p>
+    </w:sdtContent>
+  </w:sdt>
+  <w:p>
+    <w:pPr>
+      <w:ind w:right="360" w:firstLine="0"/>
+      <w:rPr>
+        <w:lang w:val="en-US"/>
+      </w:rPr>
+    </w:pPr>
+  </w:p>
+</w:hdr>
+</file>
+
+<file path=word/header3.xml><?xml version="1.0" encoding="utf-8"?>
 <w:hdr xmlns:wpc="http://schemas.microsoft.com/office/word/2010/wordprocessingCanvas" xmlns:cx="http://schemas.microsoft.com/office/drawing/2014/chartex" xmlns:cx1="http://schemas.microsoft.com/office/drawing/2015/9/8/chartex" xmlns:cx2="http://schemas.microsoft.com/office/drawing/2015/10/21/chartex" xmlns:cx3="http://schemas.microsoft.com/office/drawing/2016/5/9/chartex" xmlns:cx4="http://schemas.microsoft.com/office/drawing/2016/5/10/chartex" xmlns:cx5="http://schemas.microsoft.com/office/drawing/2016/5/11/chartex" xmlns:cx6="http://schemas.microsoft.com/office/drawing/2016/5/12/chartex" xmlns:cx7="http://schemas.microsoft.com/office/drawing/2016/5/13/chartex" xmlns:cx8="http://schemas.microsoft.com/office/drawing/2016/5/14/chartex" xmlns:mc="http://schemas.openxmlformats.org/markup-compatibility/2006" xmlns:aink="http://schemas.microsoft.com/office/drawing/2016/ink" xmlns:am3d="http://schemas.microsoft.com/office/drawing/2017/model3d" xmlns:o="urn:schemas-microsoft-com:office:office" xmlns:oel="http://schemas.microsoft.com/office/2019/extlst" xmlns:r="http://schemas.openxmlformats.org/officeDocument/2006/relationships" xmlns:m="http://schemas.openxmlformats.org/officeDocument/2006/math" xmlns:v="urn:schemas-microsoft-com:vml" xmlns:wp14="http://schemas.microsoft.com/office/word/2010/wordprocessingDrawing" xmlns:wp="http://schemas.openxmlformats.org/drawingml/2006/wordprocessingDrawing" xmlns:w10="urn:schemas-microsoft-com:office:word" xmlns:w="http://schemas.openxmlformats.org/wordprocessingml/2006/main" xmlns:w14="http://schemas.microsoft.com/office/word/2010/wordml" xmlns:w15="http://schemas.microsoft.com/office/word/2012/wordml" xmlns:w16cex="http://schemas.microsoft.com/office/word/2018/wordml/cex" xmlns:w16cid="http://schemas.microsoft.com/office/word/2016/wordml/cid" xmlns:w16="http://schemas.microsoft.com/office/word/2018/wordml" xmlns:w16du="http://schemas.microsoft.com/office/word/2023/wordml/word16du" xmlns:w16sdtdh="http://schemas.microsoft.com/office/word/2020/wordml/sdtdatahash" xmlns:w16sdtfl="http://schemas.microsoft.com/office/word/2024/wordml/sdtformatlock" xmlns:w16se="http://schemas.microsoft.com/office/word/2015/wordml/symex" xmlns:wpg="http://schemas.microsoft.com/office/word/2010/wordprocessingGroup" xmlns:wpi="http://schemas.microsoft.com/office/word/2010/wordprocessingInk" xmlns:wne="http://schemas.microsoft.com/office/word/2006/wordml" xmlns:wps="http://schemas.microsoft.com/office/word/2010/wordprocessingShape" mc:Ignorable="w14 w15 w16se w16cid w16 w16cex w16sdtdh w16sdtfl w16du wp14">
   <w:p>
     <w:r>
@@ -6484,6 +6698,7 @@
   <w:style w:type="paragraph" w:default="1" w:styleId="Normal">
     <w:name w:val="Normal"/>
     <w:qFormat/>
+    <w:rsid w:val="008139D6"/>
   </w:style>
   <w:style w:type="paragraph" w:styleId="Heading1">
     <w:name w:val="heading 1"/>
@@ -6778,6 +6993,14 @@
     <w:rPr>
       <w:b/>
     </w:rPr>
+  </w:style>
+  <w:style w:type="character" w:styleId="PageNumber">
+    <w:name w:val="page number"/>
+    <w:basedOn w:val="DefaultParagraphFont"/>
+    <w:uiPriority w:val="99"/>
+    <w:semiHidden/>
+    <w:unhideWhenUsed/>
+    <w:rsid w:val="00F543A4"/>
   </w:style>
 </w:styles>
 </file>

</xml_diff>